<commit_message>
Remover historico e arrumar o codigo do documento
</commit_message>
<xml_diff>
--- a/public/entrega.docx
+++ b/public/entrega.docx
@@ -179,7 +179,7 @@
           <w:sz w:val="28"/>
           <w:szCs w:val="28"/>
         </w:rPr>
-        <w:t>&lt;</w:t>
+        <w:t>{</w:t>
       </w:r>
       <w:r>
         <w:rPr>
@@ -189,68 +189,44 @@
         </w:rPr>
         <w:t>NOME</w:t>
       </w:r>
-      <w:proofErr w:type="gramStart"/>
-      <w:r>
-        <w:rPr>
-          <w:color w:val="000000"/>
-          <w:sz w:val="28"/>
-          <w:szCs w:val="28"/>
-        </w:rPr>
-        <w:t>&gt;</w:t>
-      </w:r>
-      <w:r>
-        <w:rPr>
-          <w:color w:val="000000"/>
-          <w:sz w:val="28"/>
-          <w:szCs w:val="28"/>
-        </w:rPr>
+      <w:r>
+        <w:rPr>
+          <w:color w:val="000000"/>
+          <w:sz w:val="28"/>
+          <w:szCs w:val="28"/>
+        </w:rPr>
+        <w:t>}</w:t>
+      </w:r>
+      <w:r>
+        <w:rPr>
+          <w:color w:val="000000"/>
+          <w:sz w:val="28"/>
+          <w:szCs w:val="28"/>
+        </w:rPr>
+        <w:t xml:space="preserve">, </w:t>
+      </w:r>
+      <w:r>
+        <w:rPr>
+          <w:color w:val="000000"/>
+          <w:sz w:val="28"/>
+          <w:szCs w:val="28"/>
+        </w:rPr>
+        <w:t>matrícula</w:t>
+      </w:r>
+      <w:r>
+        <w:rPr>
+          <w:color w:val="000000"/>
+          <w:sz w:val="28"/>
+          <w:szCs w:val="28"/>
+        </w:rPr>
+        <w:t>:</w:t>
+      </w:r>
+      <w:r>
         <w:t xml:space="preserve"> </w:t>
       </w:r>
       <w:r>
-        <w:rPr>
-          <w:color w:val="000000"/>
-          <w:sz w:val="28"/>
-          <w:szCs w:val="28"/>
-        </w:rPr>
-        <w:t>,</w:t>
-      </w:r>
-      <w:proofErr w:type="gramEnd"/>
-      <w:r>
-        <w:rPr>
-          <w:color w:val="000000"/>
-          <w:sz w:val="28"/>
-          <w:szCs w:val="28"/>
-        </w:rPr>
-        <w:t xml:space="preserve"> </w:t>
-      </w:r>
-      <w:r>
-        <w:rPr>
-          <w:color w:val="000000"/>
-          <w:sz w:val="28"/>
-          <w:szCs w:val="28"/>
-        </w:rPr>
-        <w:t>matrícula</w:t>
-      </w:r>
-      <w:r>
-        <w:rPr>
-          <w:color w:val="000000"/>
-          <w:sz w:val="28"/>
-          <w:szCs w:val="28"/>
-        </w:rPr>
-        <w:t>:</w:t>
-      </w:r>
-      <w:r>
-        <w:t xml:space="preserve"> </w:t>
-      </w:r>
-      <w:r>
-        <w:rPr>
-          <w:color w:val="000000"/>
-          <w:sz w:val="28"/>
-          <w:szCs w:val="28"/>
-        </w:rPr>
-        <w:t>&lt;</w:t>
-      </w:r>
-      <w:proofErr w:type="gramStart"/>
+        <w:t>{</w:t>
+      </w:r>
       <w:r>
         <w:rPr>
           <w:color w:val="000000"/>
@@ -259,14 +235,13 @@
         </w:rPr>
         <w:t>MATRICULA</w:t>
       </w:r>
-      <w:proofErr w:type="gramEnd"/>
-      <w:r>
-        <w:rPr>
-          <w:color w:val="000000"/>
-          <w:sz w:val="28"/>
-          <w:szCs w:val="28"/>
-        </w:rPr>
-        <w:t>&gt;</w:t>
+      <w:r>
+        <w:rPr>
+          <w:color w:val="000000"/>
+          <w:sz w:val="28"/>
+          <w:szCs w:val="28"/>
+        </w:rPr>
+        <w:t>}</w:t>
       </w:r>
       <w:r>
         <w:rPr>
@@ -364,7 +339,7 @@
           <w:sz w:val="28"/>
           <w:szCs w:val="28"/>
         </w:rPr>
-        <w:t>&lt;</w:t>
+        <w:t>{</w:t>
       </w:r>
       <w:r>
         <w:rPr>
@@ -380,7 +355,7 @@
           <w:sz w:val="28"/>
           <w:szCs w:val="28"/>
         </w:rPr>
-        <w:t>&gt;</w:t>
+        <w:t>}</w:t>
       </w:r>
       <w:r>
         <w:rPr>
@@ -410,7 +385,31 @@
           <w:sz w:val="28"/>
           <w:szCs w:val="28"/>
         </w:rPr>
-        <w:t>Patrimonio:&lt;PATRIMONIO&gt;</w:t>
+        <w:t>Patrimonio:</w:t>
+      </w:r>
+      <w:r>
+        <w:rPr>
+          <w:color w:val="000000"/>
+          <w:sz w:val="28"/>
+          <w:szCs w:val="28"/>
+        </w:rPr>
+        <w:t>{</w:t>
+      </w:r>
+      <w:r>
+        <w:rPr>
+          <w:color w:val="000000"/>
+          <w:sz w:val="28"/>
+          <w:szCs w:val="28"/>
+        </w:rPr>
+        <w:t>PATRIMONIO</w:t>
+      </w:r>
+      <w:r>
+        <w:rPr>
+          <w:color w:val="000000"/>
+          <w:sz w:val="28"/>
+          <w:szCs w:val="28"/>
+        </w:rPr>
+        <w:t>}</w:t>
       </w:r>
     </w:p>
     <w:p>
@@ -440,7 +439,7 @@
           <w:sz w:val="28"/>
           <w:szCs w:val="28"/>
         </w:rPr>
-        <w:t>&lt;</w:t>
+        <w:t>{</w:t>
       </w:r>
       <w:r>
         <w:rPr>
@@ -456,7 +455,7 @@
           <w:sz w:val="28"/>
           <w:szCs w:val="28"/>
         </w:rPr>
-        <w:t>&gt;</w:t>
+        <w:t>}</w:t>
       </w:r>
       <w:r>
         <w:rPr>
@@ -486,33 +485,15 @@
           <w:sz w:val="28"/>
           <w:szCs w:val="28"/>
         </w:rPr>
-        <w:t xml:space="preserve">Serial </w:t>
-      </w:r>
-      <w:proofErr w:type="spellStart"/>
-      <w:r>
-        <w:rPr>
-          <w:color w:val="000000"/>
-          <w:sz w:val="28"/>
-          <w:szCs w:val="28"/>
-        </w:rPr>
-        <w:t>number</w:t>
-      </w:r>
-      <w:proofErr w:type="spellEnd"/>
-      <w:r>
-        <w:rPr>
-          <w:color w:val="000000"/>
-          <w:sz w:val="28"/>
-          <w:szCs w:val="28"/>
-        </w:rPr>
-        <w:t xml:space="preserve">: </w:t>
-      </w:r>
-      <w:r>
-        <w:rPr>
-          <w:color w:val="000000"/>
-          <w:sz w:val="28"/>
-          <w:szCs w:val="28"/>
-        </w:rPr>
-        <w:t>&lt;</w:t>
+        <w:t xml:space="preserve">Serial number: </w:t>
+      </w:r>
+      <w:r>
+        <w:rPr>
+          <w:color w:val="000000"/>
+          <w:sz w:val="28"/>
+          <w:szCs w:val="28"/>
+        </w:rPr>
+        <w:t>{</w:t>
       </w:r>
       <w:r>
         <w:rPr>
@@ -528,7 +509,7 @@
           <w:sz w:val="28"/>
           <w:szCs w:val="28"/>
         </w:rPr>
-        <w:t>&gt;</w:t>
+        <w:t>}</w:t>
       </w:r>
     </w:p>
     <w:p>
@@ -629,7 +610,23 @@
           <w:sz w:val="28"/>
           <w:szCs w:val="28"/>
         </w:rPr>
-        <w:t>&lt;DATA&gt;</w:t>
+        <w:t>{</w:t>
+      </w:r>
+      <w:r>
+        <w:rPr>
+          <w:color w:val="000000"/>
+          <w:sz w:val="28"/>
+          <w:szCs w:val="28"/>
+        </w:rPr>
+        <w:t>DATA</w:t>
+      </w:r>
+      <w:r>
+        <w:rPr>
+          <w:color w:val="000000"/>
+          <w:sz w:val="28"/>
+          <w:szCs w:val="28"/>
+        </w:rPr>
+        <w:t>}</w:t>
       </w:r>
     </w:p>
     <w:p>
@@ -692,7 +689,7 @@
           <w:sz w:val="20"/>
           <w:szCs w:val="20"/>
         </w:rPr>
-        <w:t>&lt;</w:t>
+        <w:t>{</w:t>
       </w:r>
       <w:r>
         <w:rPr>
@@ -712,7 +709,7 @@
           <w:sz w:val="20"/>
           <w:szCs w:val="20"/>
         </w:rPr>
-        <w:t>&gt;</w:t>
+        <w:t>}</w:t>
       </w:r>
     </w:p>
     <w:sectPr>
@@ -816,18 +813,8 @@
                               <w:color w:val="000000"/>
                               <w:sz w:val="22"/>
                             </w:rPr>
-                            <w:t xml:space="preserve">Este conteúdo foi classificado </w:t>
+                            <w:t>Este conteúdo foi classificado como Interno</w:t>
                           </w:r>
-                          <w:proofErr w:type="gramStart"/>
-                          <w:r>
-                            <w:rPr>
-                              <w:rFonts w:ascii="Calibri" w:hAnsi="Calibri" w:cs="Calibri"/>
-                              <w:color w:val="000000"/>
-                              <w:sz w:val="22"/>
-                            </w:rPr>
-                            <w:t>como Interno</w:t>
-                          </w:r>
-                          <w:proofErr w:type="gramEnd"/>
                         </w:p>
                       </w:txbxContent>
                     </wps:txbx>
@@ -867,18 +854,8 @@
                         <w:color w:val="000000"/>
                         <w:sz w:val="22"/>
                       </w:rPr>
-                      <w:t xml:space="preserve">Este conteúdo foi classificado </w:t>
+                      <w:t>Este conteúdo foi classificado como Interno</w:t>
                     </w:r>
-                    <w:proofErr w:type="gramStart"/>
-                    <w:r>
-                      <w:rPr>
-                        <w:rFonts w:ascii="Calibri" w:hAnsi="Calibri" w:cs="Calibri"/>
-                        <w:color w:val="000000"/>
-                        <w:sz w:val="22"/>
-                      </w:rPr>
-                      <w:t>como Interno</w:t>
-                    </w:r>
-                    <w:proofErr w:type="gramEnd"/>
                   </w:p>
                 </w:txbxContent>
               </v:textbox>

</xml_diff>